<commit_message>
Add Policy Check to README example and Word templates
Adds the Policy Check field to the sample DCP block in the main
README and to all 5 Word templates in templates/word/.

Co-authored-by: Copilot <223556219+Copilot@users.noreply.github.com>
</commit_message>
<xml_diff>
--- a/templates/word/contract-review.docx
+++ b/templates/word/contract-review.docx
@@ -879,6 +879,27 @@
                 <w:sz w:val="20"/>
               </w:rPr>
               <w:t>Preserve the counterparty's defined terms and numbering</w:t>
+            </w:r>
+          </w:p>
+          <w:p>
+            <w:pPr>
+              <w:spacing w:before="0" w:after="20" w:line="260" w:lineRule="exact"/>
+              <w:ind w:left="283"/>
+            </w:pPr>
+          </w:p>
+          <w:p>
+            <w:pPr>
+              <w:spacing w:before="0" w:after="20" w:line="260" w:lineRule="exact"/>
+              <w:ind w:left="283"/>
+            </w:pPr>
+            <w:r>
+              <w:rPr>
+                <w:rFonts w:ascii="Calibri" w:hAnsi="Calibri"/>
+                <w:b w:val="0"/>
+                <w:i w:val="0"/>
+                <w:sz w:val="20"/>
+              </w:rPr>
+              <w:t xml:space="preserve">Policy Check:  Before reviewing this document, verify that the embedded policy is current if a policy server is available.</w:t>
             </w:r>
           </w:p>
         </w:tc>

</xml_diff>